<commit_message>
conclusion redo + отзыв
</commit_message>
<xml_diff>
--- a/diploma/documents/ВКР/Соломенников_Николай_Александрович_Аннотация.docx
+++ b/diploma/documents/ВКР/Соломенников_Николай_Александрович_Аннотация.docx
@@ -79,12 +79,21 @@
       <w:r>
         <w:t xml:space="preserve"> </w:t>
       </w:r>
+      <w:proofErr w:type="spellStart"/>
       <w:r>
         <w:rPr>
           <w:highlight w:val="white"/>
           <w:shd w:val="clear" w:color="auto" w:fill="FFFF00"/>
         </w:rPr>
-        <w:t>Соломенниковым Николаем Александровичем</w:t>
+        <w:t>Соломенниковым</w:t>
+      </w:r>
+      <w:proofErr w:type="spellEnd"/>
+      <w:r>
+        <w:rPr>
+          <w:highlight w:val="white"/>
+          <w:shd w:val="clear" w:color="auto" w:fill="FFFF00"/>
+        </w:rPr>
+        <w:t xml:space="preserve"> Николаем Александровичем</w:t>
       </w:r>
     </w:p>
     <w:p>
@@ -171,7 +180,7 @@
         <w:t xml:space="preserve"> 6</w:t>
       </w:r>
       <w:r>
-        <w:t>3</w:t>
+        <w:t>1</w:t>
       </w:r>
     </w:p>
     <w:p>
@@ -195,7 +204,10 @@
         <w:t>Количество литературных источников:</w:t>
       </w:r>
       <w:r>
-        <w:t xml:space="preserve"> 26</w:t>
+        <w:t xml:space="preserve"> 2</w:t>
+      </w:r>
+      <w:r>
+        <w:t>7</w:t>
       </w:r>
     </w:p>
     <w:p>
@@ -250,7 +262,15 @@
     <w:p/>
     <w:p>
       <w:r>
-        <w:t>Объектом исследования является процесс извлечения и формализации знаний из документов. Предметом исследования являются методы и средства автоматизированного пополнения онтологической модели на основе данных, извлекаемых из документов кафедры. Целью работы является разработка программной системы автоматизированного извлечения знаний из документов и их интеграции в онтологическую модель. Актуальность темы обусловлена необходимостью автоматизации обработки документов кафедры и пополнения онтологической модели в условиях высокой трудоёмкости и низкой масштабируемости ручной обработки данных. В ходе работы проведён анализ предметной области и существующих подходов к извлечению знаний, сформулированы требования к системе, разработаны архитектура системы, унифицированная модель представления документов и механизм шаблонного извлечения, реализована программная система и проведена её апробация. Основным результатом работы является система, реализующая полный цикл обработки документа: от загрузки файла до интеграции извлечённых фактов в онтологическую модель кафедры. Система поддерживает обработку нескольких форматов документов, гибридное извлечение данных с использованием шаблонов и большой языковой модели, а также ручное редактирование результатов. Научная новизна работы заключается в разработке гибридного подхода к извлечению знаний, концептно-ориентированной модели идентификации индивидов онтологии и двухслойной модели редактирования графа знаний. Практическая значимость работы заключается в автоматизации процесса извлечения и интеграции сведений из документов кафедры в единую онтологическую модель.</w:t>
+        <w:t xml:space="preserve">Объектом исследования является процесс извлечения и формализации знаний из документов. Предметом исследования являются методы и средства автоматизированного пополнения онтологической модели на основе данных, извлекаемых из документов кафедры. Целью работы является разработка программной системы автоматизированного извлечения знаний из документов и их интеграции в онтологическую модель. Актуальность темы обусловлена необходимостью автоматизации обработки документов кафедры и пополнения онтологической модели в условиях высокой трудоёмкости и низкой масштабируемости ручной обработки данных. В ходе работы проведён анализ предметной области и существующих подходов к извлечению знаний, сформулированы требования к системе, разработаны архитектура системы, унифицированная модель представления документов и механизм шаблонного извлечения, реализована программная система и проведена её апробация. Основным результатом работы является система, реализующая полный цикл обработки документа: от загрузки файла до интеграции извлечённых фактов в онтологическую модель кафедры. Система поддерживает обработку нескольких форматов документов, гибридное извлечение данных с использованием шаблонов и большой языковой модели, а также ручное редактирование результатов. Научная новизна работы заключается в разработке гибридного подхода к извлечению знаний, </w:t>
+      </w:r>
+      <w:proofErr w:type="spellStart"/>
+      <w:r>
+        <w:t>концептно</w:t>
+      </w:r>
+      <w:proofErr w:type="spellEnd"/>
+      <w:r>
+        <w:t>-ориентированной модели идентификации индивидов онтологии и двухслойной модели редактирования графа знаний. Практическая значимость работы заключается в автоматизации процесса извлечения и интеграции сведений из документов кафедры в единую онтологическую модель.</w:t>
       </w:r>
       <w:r>
         <w:t xml:space="preserve"> Система рассчитана на использование секретарями кафедры общей информатики.</w:t>

</xml_diff>